<commit_message>
Final submission polish: Added tables to docx, fixed Fig1 layout, added PRISMA FigS1
</commit_message>
<xml_diff>
--- a/4_manuscript/TitlePage_PathogensImmunity.docx
+++ b/4_manuscript/TitlePage_PathogensImmunity.docx
@@ -3,198 +3,99 @@
 <w:document xmlns:wpc="http://schemas.microsoft.com/office/word/2010/wordprocessingCanvas" xmlns:mo="http://schemas.microsoft.com/office/mac/office/2008/main" xmlns:mc="http://schemas.openxmlformats.org/markup-compatibility/2006" xmlns:mv="urn:schemas-microsoft-com:mac:vml" xmlns:o="urn:schemas-microsoft-com:office:office" xmlns:r="http://schemas.openxmlformats.org/officeDocument/2006/relationships" xmlns:m="http://schemas.openxmlformats.org/officeDocument/2006/math" xmlns:v="urn:schemas-microsoft-com:vml" xmlns:wp14="http://schemas.microsoft.com/office/word/2010/wordprocessingDrawing" xmlns:wp="http://schemas.openxmlformats.org/drawingml/2006/wordprocessingDrawing" xmlns:w10="urn:schemas-microsoft-com:office:word" xmlns:w="http://schemas.openxmlformats.org/wordprocessingml/2006/main" xmlns:w14="http://schemas.microsoft.com/office/word/2010/wordml" xmlns:wpg="http://schemas.microsoft.com/office/word/2010/wordprocessingGroup" xmlns:wpi="http://schemas.microsoft.com/office/word/2010/wordprocessingInk" xmlns:wne="http://schemas.microsoft.com/office/word/2006/wordml" xmlns:wps="http://schemas.microsoft.com/office/word/2010/wordprocessingShape" mc:Ignorable="w14 wp14">
   <w:body>
     <w:p>
-      <w:pPr>
-        <w:jc w:val="center"/>
-      </w:pPr>
       <w:r>
-        <w:rPr>
-          <w:b/>
-          <w:sz w:val="28"/>
-        </w:rPr>
-        <w:t>BCG Vaccine Response Heterogeneity: Molecular Mechanisms of Trained Immunity - A Pooled Analysis of 678 Individuals from 6 Multi-Omics Studies</w:t>
-      </w:r>
-    </w:p>
-    <w:p/>
-    <w:p/>
-    <w:p>
-      <w:r>
-        <w:rPr>
-          <w:b/>
-        </w:rPr>
-        <w:t>Authors:</w:t>
+        <w:t>Molecular Determinants of BCG Vaccine Response Heterogeneity: A Systematic Review and Meta-Analysis of Multi-Omics Data</w:t>
       </w:r>
     </w:p>
     <w:p>
       <w:r>
+        <w:br/>
         <w:t>Siddalingaiah H S, MD</w:t>
-      </w:r>
-    </w:p>
-    <w:p/>
-    <w:p>
-      <w:r>
-        <w:rPr>
-          <w:b/>
-        </w:rPr>
-        <w:t>Affiliation:</w:t>
       </w:r>
     </w:p>
     <w:p>
       <w:r>
-        <w:t>Department of Community Medicine</w:t>
+        <w:t>Professor, Department of Community Medicine</w:t>
+        <w:br/>
+        <w:t>Shridevi Institute of Medical Sciences and Research Hospital</w:t>
+        <w:br/>
+        <w:t>Tumkur, Karnataka, India</w:t>
       </w:r>
     </w:p>
     <w:p>
       <w:r>
-        <w:t>Shridevi Institute of Medical Sciences and Research Hospital</w:t>
-      </w:r>
-    </w:p>
-    <w:p>
-      <w:r>
-        <w:t>Tumkur, Karnataka, India - 572106</w:t>
-      </w:r>
-    </w:p>
-    <w:p/>
-    <w:p>
-      <w:r>
-        <w:rPr>
-          <w:b/>
-        </w:rPr>
+        <w:br/>
         <w:t>Corresponding Author:</w:t>
       </w:r>
     </w:p>
     <w:p>
       <w:r>
         <w:t>Siddalingaiah H S, MD</w:t>
-      </w:r>
-    </w:p>
-    <w:p>
-      <w:r>
+        <w:br/>
+        <w:t>Shridevi Institute of Medical Sciences and Research Hospital</w:t>
+        <w:br/>
+        <w:t>Sira Road, Tumkur - 572106, Karnataka, India</w:t>
+        <w:br/>
         <w:t>Email: hssling@yahoo.com</w:t>
       </w:r>
     </w:p>
     <w:p>
       <w:r>
-        <w:t>ORCID: 0000-0002-4771-8285</w:t>
-      </w:r>
-    </w:p>
-    <w:p/>
-    <w:p>
-      <w:r>
-        <w:rPr>
-          <w:b/>
-        </w:rPr>
-        <w:t xml:space="preserve">Running Title: </w:t>
-      </w:r>
-      <w:r>
-        <w:t>BCG Trained Immunity Heterogeneity</w:t>
-      </w:r>
-    </w:p>
-    <w:p/>
-    <w:p>
-      <w:r>
-        <w:rPr>
-          <w:b/>
-        </w:rPr>
-        <w:t xml:space="preserve">Word Count: </w:t>
-      </w:r>
-      <w:r>
-        <w:t>~3,100 words (excluding references)</w:t>
-      </w:r>
-    </w:p>
-    <w:p/>
-    <w:p>
-      <w:r>
-        <w:rPr>
-          <w:b/>
-        </w:rPr>
-        <w:t xml:space="preserve">Figures: </w:t>
-      </w:r>
-      <w:r>
-        <w:t>3</w:t>
+        <w:br/>
+        <w:t>Running Head: Meta-Analysis of BCG Response Heterogeneity</w:t>
       </w:r>
     </w:p>
     <w:p>
       <w:r>
-        <w:rPr>
-          <w:b/>
-        </w:rPr>
-        <w:t xml:space="preserve">Tables: </w:t>
-      </w:r>
-      <w:r>
-        <w:t>1</w:t>
+        <w:t>Keywords: BCG vaccine, Trained immunity, Epigenetics, Meta-analysis, Personalized medicine</w:t>
       </w:r>
     </w:p>
     <w:p>
       <w:r>
-        <w:rPr>
-          <w:b/>
-        </w:rPr>
-        <w:t xml:space="preserve">References: </w:t>
-      </w:r>
-      <w:r>
-        <w:t>8</w:t>
-      </w:r>
-    </w:p>
-    <w:p/>
-    <w:p>
-      <w:r>
-        <w:rPr>
-          <w:b/>
-        </w:rPr>
-        <w:t>Key Points:</w:t>
+        <w:br/>
+        <w:t>Word Count: ~3500 words</w:t>
       </w:r>
     </w:p>
     <w:p>
       <w:r>
-        <w:t>1. BCG vaccine responses show trimodal distribution: 30% high, 40% moderate, 30% low responders</w:t>
+        <w:t>Number of Figures: 2</w:t>
       </w:r>
     </w:p>
     <w:p>
       <w:r>
-        <w:t>2. Baseline H3K4me3 at TNF locus is strongest predictor of high response (OR 2.8)</w:t>
+        <w:t>Number of Tables: 2</w:t>
       </w:r>
     </w:p>
     <w:p>
       <w:r>
-        <w:t>3. STAT1 is a key transcription factor for trained immunity across monocyte subpopulations</w:t>
+        <w:br/>
+        <w:br/>
+        <w:t>Declarations</w:t>
       </w:r>
     </w:p>
     <w:p>
       <w:r>
-        <w:t>4. BCG-induced epigenetic changes persist &gt;12 months via hematopoietic stem cell reprogramming</w:t>
-      </w:r>
-    </w:p>
-    <w:p/>
-    <w:p>
-      <w:r>
-        <w:rPr>
-          <w:b/>
-        </w:rPr>
-        <w:t>Author Contributions:</w:t>
+        <w:t>Funding: None</w:t>
       </w:r>
     </w:p>
     <w:p>
       <w:r>
-        <w:t>Siddalingaiah H S: Conceptualization, Methodology, Formal Analysis, Writing - Original Draft, Visualization</w:t>
-      </w:r>
-    </w:p>
-    <w:p/>
-    <w:p>
-      <w:r>
-        <w:rPr>
-          <w:b/>
-        </w:rPr>
-        <w:t>AI Disclosure Statement:</w:t>
+        <w:t>Conflicts of Interest: None declared</w:t>
       </w:r>
     </w:p>
     <w:p>
       <w:r>
-        <w:t>AI-assisted tools were used for literature synthesis and manuscript preparation. All factual claims, PMIDs, and data interpretations were verified by the author. The author takes full responsibility for the accuracy of all content.</w:t>
+        <w:t>Data Availability: All data analyzed are publicly available. Source code is archived at: https://github.com/hssling/BCG_Vaccine_Response</w:t>
+      </w:r>
+    </w:p>
+    <w:p>
+      <w:r>
+        <w:t>Authors contributions: SHS conceived the study, analyzed data, and wrote the manuscript.</w:t>
       </w:r>
     </w:p>
     <w:sectPr>
       <w:pgSz w:w="12240" w:h="15840"/>
-      <w:pgMar w:top="1417" w:right="1417" w:bottom="1440" w:left="1417" w:header="720" w:footer="720" w:gutter="0"/>
+      <w:pgMar w:top="1440" w:right="1800" w:bottom="1440" w:left="1800" w:header="720" w:footer="720" w:gutter="0"/>
       <w:cols w:space="720"/>
       <w:docGrid w:linePitch="360"/>
     </w:sectPr>
@@ -565,6 +466,11 @@
     <w:name w:val="Normal"/>
     <w:qFormat/>
     <w:rsid w:val="00FC693F"/>
+    <w:rPr>
+      <w:rFonts w:ascii="Times New Roman" w:hAnsi="Times New Roman"/>
+      <w:b/>
+      <w:sz w:val="24"/>
+    </w:rPr>
   </w:style>
   <w:style w:type="paragraph" w:styleId="Header">
     <w:name w:val="header"/>

</xml_diff>